<commit_message>
Repair Year 9 Graphics program links
</commit_message>
<xml_diff>
--- a/subject-program-library/programs/year-9-graphics-teaching-program.docx
+++ b/subject-program-library/programs/year-9-graphics-teaching-program.docx
@@ -1149,6 +1149,19 @@
         </w:rPr>
         <w:t>. This is a school-developed, NESA-aligned program; it is not NESA-approved.</w:t>
       </w:r>
+      <w:r>
+        <w:t xml:space="preserve"> | </w:t>
+      </w:r>
+      <w:hyperlink r:id="rId45">
+        <w:r>
+          <w:rPr>
+            <w:rStyle w:val="Hyperlink"/>
+            <w:color w:val="0563C1"/>
+            <w:u w:val="single"/>
+          </w:rPr>
+          <w:t>Open the Year 9 Graphics course site</w:t>
+        </w:r>
+      </w:hyperlink>
     </w:p>
     <w:tbl>
       <w:tblPr>
@@ -1555,7 +1568,7 @@
                 <w:sz w:val="19"/>
               </w:rPr>
             </w:r>
-            <w:hyperlink r:id="rId13">
+            <w:hyperlink r:id="rId29">
               <w:r>
                 <w:rPr>
                   <w:rFonts w:ascii="Calibri" w:hAnsi="Calibri"/>
@@ -1752,7 +1765,7 @@
                 <w:sz w:val="19"/>
               </w:rPr>
             </w:r>
-            <w:hyperlink r:id="rId13">
+            <w:hyperlink r:id="rId29">
               <w:r>
                 <w:rPr>
                   <w:rFonts w:ascii="Calibri" w:hAnsi="Calibri"/>
@@ -1947,7 +1960,7 @@
                 <w:sz w:val="19"/>
               </w:rPr>
             </w:r>
-            <w:hyperlink r:id="rId13">
+            <w:hyperlink r:id="rId29">
               <w:r>
                 <w:rPr>
                   <w:rFonts w:ascii="Calibri" w:hAnsi="Calibri"/>
@@ -2144,7 +2157,7 @@
                 <w:sz w:val="19"/>
               </w:rPr>
             </w:r>
-            <w:hyperlink r:id="rId14">
+            <w:hyperlink r:id="rId30">
               <w:r>
                 <w:rPr>
                   <w:rFonts w:ascii="Calibri" w:hAnsi="Calibri"/>
@@ -2339,7 +2352,7 @@
                 <w:sz w:val="19"/>
               </w:rPr>
             </w:r>
-            <w:hyperlink r:id="rId14">
+            <w:hyperlink r:id="rId30">
               <w:r>
                 <w:rPr>
                   <w:rFonts w:ascii="Calibri" w:hAnsi="Calibri"/>
@@ -2536,7 +2549,7 @@
                 <w:sz w:val="19"/>
               </w:rPr>
             </w:r>
-            <w:hyperlink r:id="rId14">
+            <w:hyperlink r:id="rId30">
               <w:r>
                 <w:rPr>
                   <w:rFonts w:ascii="Calibri" w:hAnsi="Calibri"/>
@@ -2731,7 +2744,7 @@
                 <w:sz w:val="19"/>
               </w:rPr>
             </w:r>
-            <w:hyperlink r:id="rId15">
+            <w:hyperlink r:id="rId31">
               <w:r>
                 <w:rPr>
                   <w:rFonts w:ascii="Calibri" w:hAnsi="Calibri"/>
@@ -2928,7 +2941,7 @@
                 <w:sz w:val="19"/>
               </w:rPr>
             </w:r>
-            <w:hyperlink r:id="rId15">
+            <w:hyperlink r:id="rId31">
               <w:r>
                 <w:rPr>
                   <w:rFonts w:ascii="Calibri" w:hAnsi="Calibri"/>
@@ -3123,7 +3136,7 @@
                 <w:sz w:val="19"/>
               </w:rPr>
             </w:r>
-            <w:hyperlink r:id="rId15">
+            <w:hyperlink r:id="rId31">
               <w:r>
                 <w:rPr>
                   <w:rFonts w:ascii="Calibri" w:hAnsi="Calibri"/>
@@ -3320,7 +3333,7 @@
                 <w:sz w:val="19"/>
               </w:rPr>
             </w:r>
-            <w:hyperlink r:id="rId16">
+            <w:hyperlink r:id="rId32">
               <w:r>
                 <w:rPr>
                   <w:rFonts w:ascii="Calibri" w:hAnsi="Calibri"/>
@@ -3744,7 +3757,7 @@
                 <w:sz w:val="19"/>
               </w:rPr>
             </w:r>
-            <w:hyperlink r:id="rId17">
+            <w:hyperlink r:id="rId33">
               <w:r>
                 <w:rPr>
                   <w:rFonts w:ascii="Calibri" w:hAnsi="Calibri"/>
@@ -3941,7 +3954,7 @@
                 <w:sz w:val="19"/>
               </w:rPr>
             </w:r>
-            <w:hyperlink r:id="rId17">
+            <w:hyperlink r:id="rId33">
               <w:r>
                 <w:rPr>
                   <w:rFonts w:ascii="Calibri" w:hAnsi="Calibri"/>
@@ -4136,7 +4149,7 @@
                 <w:sz w:val="19"/>
               </w:rPr>
             </w:r>
-            <w:hyperlink r:id="rId17">
+            <w:hyperlink r:id="rId33">
               <w:r>
                 <w:rPr>
                   <w:rFonts w:ascii="Calibri" w:hAnsi="Calibri"/>
@@ -4333,7 +4346,7 @@
                 <w:sz w:val="19"/>
               </w:rPr>
             </w:r>
-            <w:hyperlink r:id="rId18">
+            <w:hyperlink r:id="rId34">
               <w:r>
                 <w:rPr>
                   <w:rFonts w:ascii="Calibri" w:hAnsi="Calibri"/>
@@ -4528,7 +4541,7 @@
                 <w:sz w:val="19"/>
               </w:rPr>
             </w:r>
-            <w:hyperlink r:id="rId18">
+            <w:hyperlink r:id="rId34">
               <w:r>
                 <w:rPr>
                   <w:rFonts w:ascii="Calibri" w:hAnsi="Calibri"/>
@@ -4725,7 +4738,7 @@
                 <w:sz w:val="19"/>
               </w:rPr>
             </w:r>
-            <w:hyperlink r:id="rId18">
+            <w:hyperlink r:id="rId34">
               <w:r>
                 <w:rPr>
                   <w:rFonts w:ascii="Calibri" w:hAnsi="Calibri"/>
@@ -4920,7 +4933,7 @@
                 <w:sz w:val="19"/>
               </w:rPr>
             </w:r>
-            <w:hyperlink r:id="rId19">
+            <w:hyperlink r:id="rId35">
               <w:r>
                 <w:rPr>
                   <w:rFonts w:ascii="Calibri" w:hAnsi="Calibri"/>
@@ -5117,7 +5130,7 @@
                 <w:sz w:val="19"/>
               </w:rPr>
             </w:r>
-            <w:hyperlink r:id="rId19">
+            <w:hyperlink r:id="rId35">
               <w:r>
                 <w:rPr>
                   <w:rFonts w:ascii="Calibri" w:hAnsi="Calibri"/>
@@ -5312,7 +5325,7 @@
                 <w:sz w:val="19"/>
               </w:rPr>
             </w:r>
-            <w:hyperlink r:id="rId19">
+            <w:hyperlink r:id="rId35">
               <w:r>
                 <w:rPr>
                   <w:rFonts w:ascii="Calibri" w:hAnsi="Calibri"/>
@@ -5509,7 +5522,7 @@
                 <w:sz w:val="19"/>
               </w:rPr>
             </w:r>
-            <w:hyperlink r:id="rId20">
+            <w:hyperlink r:id="rId36">
               <w:r>
                 <w:rPr>
                   <w:rFonts w:ascii="Calibri" w:hAnsi="Calibri"/>
@@ -5933,7 +5946,7 @@
                 <w:sz w:val="19"/>
               </w:rPr>
             </w:r>
-            <w:hyperlink r:id="rId21">
+            <w:hyperlink r:id="rId37">
               <w:r>
                 <w:rPr>
                   <w:rFonts w:ascii="Calibri" w:hAnsi="Calibri"/>
@@ -6130,7 +6143,7 @@
                 <w:sz w:val="19"/>
               </w:rPr>
             </w:r>
-            <w:hyperlink r:id="rId21">
+            <w:hyperlink r:id="rId37">
               <w:r>
                 <w:rPr>
                   <w:rFonts w:ascii="Calibri" w:hAnsi="Calibri"/>
@@ -6325,7 +6338,7 @@
                 <w:sz w:val="19"/>
               </w:rPr>
             </w:r>
-            <w:hyperlink r:id="rId21">
+            <w:hyperlink r:id="rId37">
               <w:r>
                 <w:rPr>
                   <w:rFonts w:ascii="Calibri" w:hAnsi="Calibri"/>
@@ -6522,7 +6535,7 @@
                 <w:sz w:val="19"/>
               </w:rPr>
             </w:r>
-            <w:hyperlink r:id="rId22">
+            <w:hyperlink r:id="rId38">
               <w:r>
                 <w:rPr>
                   <w:rFonts w:ascii="Calibri" w:hAnsi="Calibri"/>
@@ -6717,7 +6730,7 @@
                 <w:sz w:val="19"/>
               </w:rPr>
             </w:r>
-            <w:hyperlink r:id="rId22">
+            <w:hyperlink r:id="rId38">
               <w:r>
                 <w:rPr>
                   <w:rFonts w:ascii="Calibri" w:hAnsi="Calibri"/>
@@ -6914,7 +6927,7 @@
                 <w:sz w:val="19"/>
               </w:rPr>
             </w:r>
-            <w:hyperlink r:id="rId22">
+            <w:hyperlink r:id="rId38">
               <w:r>
                 <w:rPr>
                   <w:rFonts w:ascii="Calibri" w:hAnsi="Calibri"/>
@@ -7109,7 +7122,7 @@
                 <w:sz w:val="19"/>
               </w:rPr>
             </w:r>
-            <w:hyperlink r:id="rId23">
+            <w:hyperlink r:id="rId39">
               <w:r>
                 <w:rPr>
                   <w:rFonts w:ascii="Calibri" w:hAnsi="Calibri"/>
@@ -7306,7 +7319,7 @@
                 <w:sz w:val="19"/>
               </w:rPr>
             </w:r>
-            <w:hyperlink r:id="rId23">
+            <w:hyperlink r:id="rId39">
               <w:r>
                 <w:rPr>
                   <w:rFonts w:ascii="Calibri" w:hAnsi="Calibri"/>
@@ -7501,7 +7514,7 @@
                 <w:sz w:val="19"/>
               </w:rPr>
             </w:r>
-            <w:hyperlink r:id="rId23">
+            <w:hyperlink r:id="rId39">
               <w:r>
                 <w:rPr>
                   <w:rFonts w:ascii="Calibri" w:hAnsi="Calibri"/>
@@ -7698,7 +7711,7 @@
                 <w:sz w:val="19"/>
               </w:rPr>
             </w:r>
-            <w:hyperlink r:id="rId24">
+            <w:hyperlink r:id="rId40">
               <w:r>
                 <w:rPr>
                   <w:rFonts w:ascii="Calibri" w:hAnsi="Calibri"/>
@@ -8122,7 +8135,7 @@
                 <w:sz w:val="19"/>
               </w:rPr>
             </w:r>
-            <w:hyperlink r:id="rId25">
+            <w:hyperlink r:id="rId41">
               <w:r>
                 <w:rPr>
                   <w:rFonts w:ascii="Calibri" w:hAnsi="Calibri"/>
@@ -8319,7 +8332,7 @@
                 <w:sz w:val="19"/>
               </w:rPr>
             </w:r>
-            <w:hyperlink r:id="rId25">
+            <w:hyperlink r:id="rId41">
               <w:r>
                 <w:rPr>
                   <w:rFonts w:ascii="Calibri" w:hAnsi="Calibri"/>
@@ -8514,7 +8527,7 @@
                 <w:sz w:val="19"/>
               </w:rPr>
             </w:r>
-            <w:hyperlink r:id="rId25">
+            <w:hyperlink r:id="rId41">
               <w:r>
                 <w:rPr>
                   <w:rFonts w:ascii="Calibri" w:hAnsi="Calibri"/>
@@ -8711,7 +8724,7 @@
                 <w:sz w:val="19"/>
               </w:rPr>
             </w:r>
-            <w:hyperlink r:id="rId26">
+            <w:hyperlink r:id="rId42">
               <w:r>
                 <w:rPr>
                   <w:rFonts w:ascii="Calibri" w:hAnsi="Calibri"/>
@@ -8906,7 +8919,7 @@
                 <w:sz w:val="19"/>
               </w:rPr>
             </w:r>
-            <w:hyperlink r:id="rId26">
+            <w:hyperlink r:id="rId42">
               <w:r>
                 <w:rPr>
                   <w:rFonts w:ascii="Calibri" w:hAnsi="Calibri"/>
@@ -9103,7 +9116,7 @@
                 <w:sz w:val="19"/>
               </w:rPr>
             </w:r>
-            <w:hyperlink r:id="rId26">
+            <w:hyperlink r:id="rId42">
               <w:r>
                 <w:rPr>
                   <w:rFonts w:ascii="Calibri" w:hAnsi="Calibri"/>
@@ -9298,7 +9311,7 @@
                 <w:sz w:val="19"/>
               </w:rPr>
             </w:r>
-            <w:hyperlink r:id="rId27">
+            <w:hyperlink r:id="rId43">
               <w:r>
                 <w:rPr>
                   <w:rFonts w:ascii="Calibri" w:hAnsi="Calibri"/>
@@ -9495,7 +9508,7 @@
                 <w:sz w:val="19"/>
               </w:rPr>
             </w:r>
-            <w:hyperlink r:id="rId27">
+            <w:hyperlink r:id="rId43">
               <w:r>
                 <w:rPr>
                   <w:rFonts w:ascii="Calibri" w:hAnsi="Calibri"/>
@@ -9690,7 +9703,7 @@
                 <w:sz w:val="19"/>
               </w:rPr>
             </w:r>
-            <w:hyperlink r:id="rId27">
+            <w:hyperlink r:id="rId43">
               <w:r>
                 <w:rPr>
                   <w:rFonts w:ascii="Calibri" w:hAnsi="Calibri"/>
@@ -9887,7 +9900,7 @@
                 <w:sz w:val="19"/>
               </w:rPr>
             </w:r>
-            <w:hyperlink r:id="rId28">
+            <w:hyperlink r:id="rId44">
               <w:r>
                 <w:rPr>
                   <w:rFonts w:ascii="Calibri" w:hAnsi="Calibri"/>

</xml_diff>